<commit_message>
Them file xac minh Google
</commit_message>
<xml_diff>
--- a/Lệnh.docx
+++ b/Lệnh.docx
@@ -16,19 +16,20 @@
         <w:t xml:space="preserve"> </w:t>
       </w:r>
       <w:r>
-        <w:t>python -m PyInstaller --noconsole --onefile --add-data "</w:t>
+        <w:t>python -m PyInstaller --noconsole --onefile --add-data "templates;templates" desktop_app.py</w:t>
       </w:r>
-      <w:proofErr w:type="gramStart"/>
       <w:r>
-        <w:t>templates;templates</w:t>
+        <w:br/>
       </w:r>
-      <w:proofErr w:type="gramEnd"/>
       <w:r>
-        <w:t>" desktop_app.py</w:t>
+        <w:t>python -m PyInstaller --noconsole --onefile --add-data "templates;templates" --add-data "static;static" desktop_app.py</w:t>
       </w:r>
     </w:p>
-    <w:p/>
-    <w:p/>
+    <w:p>
+      <w:r>
+        <w:t>git push origin main --force</w:t>
+      </w:r>
+    </w:p>
     <w:p/>
     <w:p>
       <w:pPr>
@@ -65,33 +66,18 @@
       </w:r>
     </w:p>
     <w:p>
-      <w:proofErr w:type="gramStart"/>
       <w:r>
-        <w:t>  git</w:t>
-      </w:r>
-      <w:proofErr w:type="gramEnd"/>
-      <w:r>
-        <w:t xml:space="preserve"> add . (Đưa toàn bộ thay đổi vào danh sách chờ)</w:t>
+        <w:t>  git add . (Đưa toàn bộ thay đổi vào danh sách chờ)</w:t>
       </w:r>
     </w:p>
     <w:p>
-      <w:proofErr w:type="gramStart"/>
       <w:r>
-        <w:t>  git</w:t>
-      </w:r>
-      <w:proofErr w:type="gramEnd"/>
-      <w:r>
-        <w:t xml:space="preserve"> commit -m "Noi dung ghi chu" (Lưu lại các thay đổi kèm theo lời nhắn)</w:t>
+        <w:t>  git commit -m "Noi dung ghi chu" (Lưu lại các thay đổi kèm theo lời nhắn)</w:t>
       </w:r>
     </w:p>
     <w:p>
-      <w:proofErr w:type="gramStart"/>
       <w:r>
-        <w:t>  git</w:t>
-      </w:r>
-      <w:proofErr w:type="gramEnd"/>
-      <w:r>
-        <w:t xml:space="preserve"> push origin main (Đẩy code lên nhánh chính của kho lưu trữ trên GitHub)</w:t>
+        <w:t>  git push origin main (Đẩy code lên nhánh chính của kho lưu trữ trên GitHub)</w:t>
       </w:r>
     </w:p>
     <w:p/>
@@ -708,6 +694,7 @@
   <w:style w:type="character" w:default="1" w:styleId="DefaultParagraphFont">
     <w:name w:val="Default Paragraph Font"/>
     <w:uiPriority w:val="1"/>
+    <w:semiHidden/>
     <w:unhideWhenUsed/>
   </w:style>
   <w:style w:type="table" w:default="1" w:styleId="TableNormal">

</xml_diff>

<commit_message>
Cap nhat trang bao tri
</commit_message>
<xml_diff>
--- a/Lệnh.docx
+++ b/Lệnh.docx
@@ -16,21 +16,17 @@
         <w:t xml:space="preserve"> </w:t>
       </w:r>
       <w:r>
-        <w:t>python -m PyInstaller --noconsole --onefile --add-data "templates;templates" desktop_app.py</w:t>
+        <w:t>git pull origin main</w:t>
       </w:r>
       <w:r>
-        <w:br/>
-      </w:r>
-      <w:r>
-        <w:t>python -m PyInstaller --noconsole --onefile --add-data "templates;templates" --add-data "static;static" desktop_app.py</w:t>
+        <w:t xml:space="preserve">    ( lôi dữ liệu từ github về )</w:t>
       </w:r>
     </w:p>
     <w:p>
       <w:r>
-        <w:t>git push origin main --force</w:t>
+        <w:t>python -m PyInstaller --clean --noconsole --onefile --name AI_KhangPhan --add-data "templates;templates" --add-data "static;static" --hidden-import=pymongo app.py</w:t>
       </w:r>
     </w:p>
-    <w:p/>
     <w:p>
       <w:pPr>
         <w:rPr>

</xml_diff>